<commit_message>
Stage 12: conductance-identifiability reframing, OOD decomposition, v1.3.0
</commit_message>
<xml_diff>
--- a/manuscript/Cover_Letter_CPC.docx
+++ b/manuscript/Cover_Letter_CPC.docx
@@ -19,7 +19,7 @@
         <w:t>Date:</w:t>
       </w:r>
       <w:r>
-        <w:t xml:space="preserve"> 19 October 2026</w:t>
+        <w:t xml:space="preserve"> 20 October 2026</w:t>
       </w:r>
     </w:p>
     <w:p/>
@@ -66,7 +66,7 @@
         <w:rPr>
           <w:b/>
         </w:rPr>
-        <w:t>"A parameter-conditioned physics-informed neural operator for axisymmetric Poisson--Nernst--Planck transport in charged nanopores"</w:t>
+        <w:t>"Conductance identifiability limits and physics-constrained neural operators for axisymmetric Poisson--Nernst--Planck transport in charged nanopores"</w:t>
       </w:r>
       <w:r>
         <w:t xml:space="preserve"> for consideration at </w:t>
@@ -522,7 +522,52 @@
         <w:t>An inverse-sensing demonstration and an identifiability result.</w:t>
       </w:r>
       <w:r>
-        <w:t xml:space="preserve"> A gradient-free inverse recovery runs roughly 3,200-fold faster than the finite-volume reference solver. A Fisher-information analysis and a 15-state, three-protocol study reveal a physical conductance identifiability boundary: the pore radius is recoverable from a five-bias current–voltage curve to 0.46%, whereas the surface charge is a flat direction whose current signature stays below the 1% noise floor at every operating point. Neither single-salt nor multi-salt current–voltage data resolve that charge; adding an independent near-wall selectivity observable recovers both radius and wall charge to below 0.3%.</w:t>
+        <w:t xml:space="preserve"> A gradient-free inverse recovery runs roughly 3,200-fold faster than the finite-volume reference solver. A Fisher-information analysis and a 15-state, three-protocol study reveal a physical conductance identifiability boundary: the pore radius is recoverable from a five-bias current–voltage curve to 0.46%, whereas the surface charge is a flat direction whose current signature stays below the 1% noise floor at every operating point. Neither single-salt nor multi-salt current–voltage data resolve that charge; adding an independent near-wall selectivity observable recovers both radius and wall charge to below 0.3%. The contrast is a limitation of the measurement, not of the surrogate or solver: the exact SG/FV Fisher matrix gives </w:t>
+      </w:r>
+      <m:oMath xmlns:a="http://schemas.openxmlformats.org/drawingml/2006/main" xmlns:pic="http://schemas.openxmlformats.org/drawingml/2006/picture">
+        <m:r>
+          <m:t>κ</m:t>
+        </m:r>
+        <m:r>
+          <m:rPr>
+            <m:sty m:val="p"/>
+          </m:rPr>
+          <m:t>(</m:t>
+        </m:r>
+        <m:r>
+          <m:rPr>
+            <m:scr m:val="script"/>
+            <m:sty m:val="p"/>
+          </m:rPr>
+          <m:t>F</m:t>
+        </m:r>
+        <m:r>
+          <m:rPr>
+            <m:sty m:val="p"/>
+          </m:rPr>
+          <m:t>)</m:t>
+        </m:r>
+        <m:r>
+          <m:rPr>
+            <m:sty m:val="p"/>
+          </m:rPr>
+          <m:t>&gt;</m:t>
+        </m:r>
+        <m:sSup>
+          <m:e>
+            <m:r>
+              <m:t>10</m:t>
+            </m:r>
+          </m:e>
+          <m:sup>
+            <m:r>
+              <m:t>8</m:t>
+            </m:r>
+          </m:sup>
+        </m:sSup>
+      </m:oMath>
+      <w:r>
+        <w:t xml:space="preserve"> for conductance-only protocols.</w:t>
       </w:r>
     </w:p>
     <w:p/>
@@ -537,7 +582,7 @@
         <w:t>Scope-bounding ablations.</w:t>
       </w:r>
       <w:r>
-        <w:t xml:space="preserve"> A trunk ablation at matched capacity shows that the multi-scale radial basis is a modest near-wall inductive bias rather than a necessity (about 7% lower wall-gradient error, no bulk-accuracy advantage), and a nested 384-state study gives an in-distribution data-scaling exponent of 0.55 close to the expected N^−1/2, while out-of-distribution error is nearly data-insensitive.</w:t>
+        <w:t xml:space="preserve"> A trunk ablation at matched capacity shows that the multi-scale radial basis is a modest near-wall inductive bias rather than a necessity (about 7% lower wall-gradient error, no bulk-accuracy advantage), and a nested 384-state study gives an in-distribution data-scaling exponent of 0.55 close to the expected N^−1/2, while out-of-distribution error is nearly data-insensitive; a spatial decomposition shows that the residual OOD error is concentrated in the wall EDL and reservoir transitions but cancels in the integrated current.</w:t>
       </w:r>
     </w:p>
     <w:p/>

</xml_diff>

<commit_message>
Stage 13: Zenodo DOI, diffusivity-asymmetry proof, CPiP polish, v1.3.1
</commit_message>
<xml_diff>
--- a/manuscript/Cover_Letter_CPC.docx
+++ b/manuscript/Cover_Letter_CPC.docx
@@ -55,6 +55,21 @@
     <w:p>
       <w:r>
         <w:t>Dear Editors,</w:t>
+      </w:r>
+    </w:p>
+    <w:p/>
+    <w:p>
+      <w:r>
+        <w:t xml:space="preserve">We submit this manuscript for consideration in </w:t>
+      </w:r>
+      <w:r>
+        <w:rPr>
+          <w:i/>
+        </w:rPr>
+        <w:t>Computer Physics Communications</w:t>
+      </w:r>
+      <w:r>
+        <w:t xml:space="preserve"> under the Computer Programs in Physics (CPiP) category. The software package PINO-Nanopore (archived permanently at Zenodo DOI: 10.5281/zenodo.23487404 and deployed interactively at https://pino.statwhy.com) provides a validated, exact-boundary solution operator for steady axisymmetric Poisson–Nernst–Planck transport, whose primary scientific application is high-throughput Fisher-information and conductance-identifiability mapping for nanopore experiments.</w:t>
       </w:r>
     </w:p>
     <w:p/>
@@ -720,6 +735,213 @@
     <w:p/>
     <w:p>
       <w:r>
+        <w:t xml:space="preserve">8. </w:t>
+      </w:r>
+      <w:r>
+        <w:rPr>
+          <w:b/>
+        </w:rPr>
+        <w:t>A diffusivity-asymmetry proof and a protocol-design workflow.</w:t>
+      </w:r>
+      <w:r>
+        <w:t xml:space="preserve"> We show analytically that the local ohmic coefficient is </w:t>
+      </w:r>
+      <m:oMath xmlns:a="http://schemas.openxmlformats.org/drawingml/2006/main" xmlns:pic="http://schemas.openxmlformats.org/drawingml/2006/picture">
+        <m:acc>
+          <m:accPr>
+            <m:chr m:val="‾"/>
+          </m:accPr>
+          <m:e>
+            <m:r>
+              <m:t>D</m:t>
+            </m:r>
+          </m:e>
+        </m:acc>
+        <m:rad>
+          <m:radPr>
+            <m:degHide m:val="on"/>
+          </m:radPr>
+          <m:deg/>
+          <m:e>
+            <m:sSup>
+              <m:e>
+                <m:r>
+                  <m:t>s</m:t>
+                </m:r>
+              </m:e>
+              <m:sup>
+                <m:r>
+                  <m:t>2</m:t>
+                </m:r>
+              </m:sup>
+            </m:sSup>
+            <m:r>
+              <m:rPr>
+                <m:sty m:val="p"/>
+              </m:rPr>
+              <m:t>+</m:t>
+            </m:r>
+            <m:sSup>
+              <m:e>
+                <m:r>
+                  <m:t>ρ</m:t>
+                </m:r>
+              </m:e>
+              <m:sup>
+                <m:r>
+                  <m:t>2</m:t>
+                </m:r>
+              </m:sup>
+            </m:sSup>
+          </m:e>
+        </m:rad>
+        <m:r>
+          <m:rPr>
+            <m:sty m:val="p"/>
+          </m:rPr>
+          <m:t>+</m:t>
+        </m:r>
+        <m:f>
+          <m:fPr>
+            <m:type m:val="lin"/>
+          </m:fPr>
+          <m:num>
+            <m:r>
+              <m:t>1</m:t>
+            </m:r>
+          </m:num>
+          <m:den>
+            <m:r>
+              <m:t>2</m:t>
+            </m:r>
+          </m:den>
+        </m:f>
+        <m:r>
+          <m:rPr>
+            <m:sty m:val="p"/>
+          </m:rPr>
+          <m:t>(</m:t>
+        </m:r>
+        <m:sSub>
+          <m:e>
+            <m:r>
+              <m:t>D</m:t>
+            </m:r>
+          </m:e>
+          <m:sub>
+            <m:r>
+              <m:rPr>
+                <m:sty m:val="p"/>
+              </m:rPr>
+              <m:t>+</m:t>
+            </m:r>
+          </m:sub>
+        </m:sSub>
+        <m:r>
+          <m:rPr>
+            <m:sty m:val="p"/>
+          </m:rPr>
+          <m:t>−</m:t>
+        </m:r>
+        <m:sSub>
+          <m:e>
+            <m:r>
+              <m:t>D</m:t>
+            </m:r>
+          </m:e>
+          <m:sub>
+            <m:r>
+              <m:rPr>
+                <m:sty m:val="p"/>
+              </m:rPr>
+              <m:t>−</m:t>
+            </m:r>
+          </m:sub>
+        </m:sSub>
+        <m:r>
+          <m:rPr>
+            <m:sty m:val="p"/>
+          </m:rPr>
+          <m:t>)</m:t>
+        </m:r>
+        <m:r>
+          <m:t>ρ</m:t>
+        </m:r>
+      </m:oMath>
+      <w:r>
+        <w:t>, so equal diffusivities leave only a second-order charge term, and verify with the exact float64 SG/FV solver at four diffusivity ratios (</w:t>
+      </w:r>
+      <m:oMath xmlns:a="http://schemas.openxmlformats.org/drawingml/2006/main" xmlns:pic="http://schemas.openxmlformats.org/drawingml/2006/picture">
+        <m:sSub>
+          <m:e>
+            <m:r>
+              <m:t>D</m:t>
+            </m:r>
+          </m:e>
+          <m:sub>
+            <m:r>
+              <m:rPr>
+                <m:sty m:val="p"/>
+              </m:rPr>
+              <m:t>+</m:t>
+            </m:r>
+          </m:sub>
+        </m:sSub>
+        <m:r>
+          <m:rPr>
+            <m:sty m:val="p"/>
+          </m:rPr>
+          <m:t>/</m:t>
+        </m:r>
+        <m:sSub>
+          <m:e>
+            <m:r>
+              <m:t>D</m:t>
+            </m:r>
+          </m:e>
+          <m:sub>
+            <m:r>
+              <m:rPr>
+                <m:sty m:val="p"/>
+              </m:rPr>
+              <m:t>−</m:t>
+            </m:r>
+          </m:sub>
+        </m:sSub>
+        <m:r>
+          <m:rPr>
+            <m:sty m:val="p"/>
+          </m:rPr>
+          <m:t>=</m:t>
+        </m:r>
+        <m:r>
+          <m:t>1.0</m:t>
+        </m:r>
+      </m:oMath>
+      <w:r>
+        <w:t xml:space="preserve">, 0.966, 0.655, 0.20) and two salinities. Even NaCl leaves the single-salt condition number above </w:t>
+      </w:r>
+      <m:oMath xmlns:a="http://schemas.openxmlformats.org/drawingml/2006/main" xmlns:pic="http://schemas.openxmlformats.org/drawingml/2006/picture">
+        <m:sSup>
+          <m:e>
+            <m:r>
+              <m:t>10</m:t>
+            </m:r>
+          </m:e>
+          <m:sup>
+            <m:r>
+              <m:t>16</m:t>
+            </m:r>
+          </m:sup>
+        </m:sSup>
+      </m:oMath>
+      <w:r>
+        <w:t>, while adding the near-wall selectivity observable reduces it by six to ten orders of magnitude. The released package and portal expose the Jacobian and Fisher construction so that experimentalists can optimize bias, salinity, and observable combinations before fabricating or measuring a pore.</w:t>
+      </w:r>
+    </w:p>
+    <w:p/>
+    <w:p>
+      <w:r>
         <w:t>The manuscript is original, has not been published previously, and is not under consideration elsewhere. All authors have approved the submission, and the author declares no competing interests.</w:t>
       </w:r>
     </w:p>
@@ -732,7 +954,7 @@
         <w:t>Data and code availability.</w:t>
       </w:r>
       <w:r>
-        <w:t xml:space="preserve"> The reproducibility package is available at https://github.com/Javad-Alizargar/nanopore-pino-surrogate under the MIT License, and the interactive simulator is hosted at https://pino.statwhy.com/. A permanent Zenodo DOI will be minted upon acceptance.</w:t>
+        <w:t xml:space="preserve"> The reproducibility package is available at https://github.com/Javad-Alizargar/nanopore-pino-surrogate under the MIT License, and the interactive simulator is hosted at https://pino.statwhy.com/. The permanently archived release is available at Zenodo DOI: 10.5281/zenodo.23487404.</w:t>
       </w:r>
     </w:p>
     <w:p/>

</xml_diff>

<commit_message>
Stage 15: fix figure labels, citation integrity, CPC template, v1.3.3
</commit_message>
<xml_diff>
--- a/manuscript/Cover_Letter_CPC.docx
+++ b/manuscript/Cover_Letter_CPC.docx
@@ -954,7 +954,37 @@
         <w:t>Data and code availability.</w:t>
       </w:r>
       <w:r>
-        <w:t xml:space="preserve"> The reproducibility package is available at https://github.com/Javad-Alizargar/nanopore-pino-surrogate under the MIT License, and the interactive simulator is hosted at https://pino.statwhy.com/. The permanently archived release is available at Zenodo DOI: 10.5281/zenodo.23487404.</w:t>
+        <w:t xml:space="preserve"> The reproducibility package is available at https://github.com/Javad-Alizargar/nanopore-pino-surrogate under the MIT License, and the interactive simulator is hosted at https://pino.statwhy.com/. The permanently archived release is available at Zenodo DOI: 10.5281/zenodo.23487404. The repository and archive contain a comprehensive </w:t>
+      </w:r>
+      <w:r>
+        <w:rPr>
+          <w:rFonts w:ascii="Consolas" w:hAnsi="Consolas"/>
+          <w:sz w:val="19"/>
+        </w:rPr>
+        <w:t>README.md</w:t>
+      </w:r>
+      <w:r>
+        <w:t xml:space="preserve"> covering all files, installation, and execution, together with complete sample test-run input and output files in </w:t>
+      </w:r>
+      <w:r>
+        <w:rPr>
+          <w:rFonts w:ascii="Consolas" w:hAnsi="Consolas"/>
+          <w:sz w:val="19"/>
+        </w:rPr>
+        <w:t>test_run/</w:t>
+      </w:r>
+      <w:r>
+        <w:t xml:space="preserve">; </w:t>
+      </w:r>
+      <w:r>
+        <w:rPr>
+          <w:rFonts w:ascii="Consolas" w:hAnsi="Consolas"/>
+          <w:sz w:val="19"/>
+        </w:rPr>
+        <w:t>scripts/run_cpc_test_case.py</w:t>
+      </w:r>
+      <w:r>
+        <w:t xml:space="preserve"> runs that self-contained CPC verification case.</w:t>
       </w:r>
     </w:p>
     <w:p/>

</xml_diff>

<commit_message>
Stage 19: Weyl-gated hybrid solver, reversal-potential limits, v1.5.0 release
</commit_message>
<xml_diff>
--- a/manuscript/Cover_Letter_CPC.docx
+++ b/manuscript/Cover_Letter_CPC.docx
@@ -19,7 +19,7 @@
         <w:t>Date:</w:t>
       </w:r>
       <w:r>
-        <w:t xml:space="preserve"> 20 October 2026</w:t>
+        <w:t xml:space="preserve"> 21 October 2026</w:t>
       </w:r>
     </w:p>
     <w:p/>
@@ -81,7 +81,7 @@
         <w:rPr>
           <w:b/>
         </w:rPr>
-        <w:t>"Conductance identifiability limits and physics-constrained neural operators for axisymmetric Poisson--Nernst--Planck transport in charged nanopores"</w:t>
+        <w:t>"Sensitivity-controlled physics-constrained neural operators and conductance identifiability limits for Poisson--Nernst--Planck transport in charged nanopores"</w:t>
       </w:r>
       <w:r>
         <w:t xml:space="preserve"> for consideration at </w:t>
@@ -507,7 +507,7 @@
         </m:r>
       </m:oMath>
       <w:r>
-        <w:t>. This enforces the reservoir boundary conditions exactly and removes the subtractive cancellation that limits net-charge accuracy, reducing net-charge error 8.63-fold (DeepONet) and 10.29-fold (FNO) relative to a direct-concentration output.</w:t>
+        <w:t>. This enforces the reservoir boundary conditions exactly and removes the subtractive cancellation that limits net-charge accuracy, reducing net-charge error 8.63-fold (DeepONet) and 10.29-fold (FNO) relative to a naive direct-concentration output; against a fairly trained direct loss, the improvement is 13% net charge and 18% current.</w:t>
       </w:r>
     </w:p>
     <w:p/>
@@ -537,7 +537,24 @@
         <w:t>An inverse-sensing demonstration and an identifiability result.</w:t>
       </w:r>
       <w:r>
-        <w:t xml:space="preserve"> A gradient-free inverse recovery runs roughly 3,200-fold faster than the finite-volume reference solver. A Fisher-information analysis and a 15-state, three-protocol study reveal a physical conductance identifiability boundary: the pore radius is recoverable from a five-bias current–voltage curve to 0.46%, whereas the surface charge is a flat direction whose current signature stays below the 1% noise floor at every operating point. Neither single-salt nor multi-salt current–voltage data resolve that charge; adding an independent near-wall selectivity observable recovers both radius and wall charge to below 0.3%. The contrast is a limitation of the measurement, not of the surrogate or solver: the exact SG/FV Fisher matrix gives </w:t>
+        <w:t xml:space="preserve"> A gradient-free inverse recovery runs roughly 3,200-fold faster than the finite-volume reference solver. A Fisher-information analysis and a 15-state, 20-realization study reveal a physical conductance identifiability boundary: dual current–plus–near-wall-selectivity inversion recovers the pore radius to 0.10% and the surface charge to 4.8%, whereas neither single-salt nor multi-salt current–voltage data resolve the charge. The negative-</w:t>
+      </w:r>
+      <m:oMath xmlns:a="http://schemas.openxmlformats.org/drawingml/2006/main" xmlns:pic="http://schemas.openxmlformats.org/drawingml/2006/picture">
+        <m:sSub>
+          <m:e>
+            <m:r>
+              <m:t>q</m:t>
+            </m:r>
+          </m:e>
+          <m:sub>
+            <m:r>
+              <m:t>w</m:t>
+            </m:r>
+          </m:sub>
+        </m:sSub>
+      </m:oMath>
+      <w:r>
+        <w:t xml:space="preserve"> Fisher plane is ill-conditioned (median </w:t>
       </w:r>
       <m:oMath xmlns:a="http://schemas.openxmlformats.org/drawingml/2006/main" xmlns:pic="http://schemas.openxmlformats.org/drawingml/2006/picture">
         <m:r>
@@ -566,8 +583,34 @@
           <m:rPr>
             <m:sty m:val="p"/>
           </m:rPr>
-          <m:t>&gt;</m:t>
+          <m:t>=</m:t>
         </m:r>
+        <m:r>
+          <m:t>1.2</m:t>
+        </m:r>
+        <m:r>
+          <m:rPr>
+            <m:sty m:val="p"/>
+          </m:rPr>
+          <m:t>×</m:t>
+        </m:r>
+        <m:sSup>
+          <m:e>
+            <m:r>
+              <m:t>10</m:t>
+            </m:r>
+          </m:e>
+          <m:sup>
+            <m:r>
+              <m:t>9</m:t>
+            </m:r>
+          </m:sup>
+        </m:sSup>
+      </m:oMath>
+      <w:r>
+        <w:t xml:space="preserve">; 99.1% above </w:t>
+      </w:r>
+      <m:oMath xmlns:a="http://schemas.openxmlformats.org/drawingml/2006/main" xmlns:pic="http://schemas.openxmlformats.org/drawingml/2006/picture">
         <m:sSup>
           <m:e>
             <m:r>
@@ -582,7 +625,7 @@
         </m:sSup>
       </m:oMath>
       <w:r>
-        <w:t xml:space="preserve"> for conductance-only protocols.</w:t>
+        <w:t>), with a 1%-noise CRLB of 0.37% for radius but 86 for charge. The contrast is a limitation of the measurement, not of the surrogate or solver.</w:t>
       </w:r>
     </w:p>
     <w:p/>
@@ -695,19 +738,13 @@
       </w:r>
       <m:oMath xmlns:a="http://schemas.openxmlformats.org/drawingml/2006/main" xmlns:pic="http://schemas.openxmlformats.org/drawingml/2006/picture">
         <m:r>
-          <m:t>1.5</m:t>
+          <m:t>1.1</m:t>
         </m:r>
         <m:r>
-          <m:t>i</m:t>
-        </m:r>
-        <m:r>
-          <m:t>m</m:t>
-        </m:r>
-        <m:r>
-          <m:t>e</m:t>
-        </m:r>
-        <m:r>
-          <m:t>s</m:t>
+          <m:rPr>
+            <m:sty m:val="p"/>
+          </m:rPr>
+          <m:t>×</m:t>
         </m:r>
         <m:sSup>
           <m:e>
@@ -729,7 +766,7 @@
         </m:sSup>
       </m:oMath>
       <w:r>
-        <w:t>, and both collapse the charge-conditioning number by ten orders of magnitude once the near-wall selectivity observable is added.</w:t>
+        <w:t>, while both show a near-null single-salt charge direction that the near-wall selectivity observable resolves.</w:t>
       </w:r>
     </w:p>
     <w:p/>
@@ -919,9 +956,39 @@
         </m:r>
       </m:oMath>
       <w:r>
-        <w:t xml:space="preserve">, 0.966, 0.655, 0.20) and two salinities. Even NaCl leaves the single-salt condition number above </w:t>
+        <w:t>, 0.966, 0.655, 0.20) and two salinities. Even NaCl leaves the single-salt charge direction poorly conditioned, while adding the near-wall selectivity observable breaks the degeneracy. The released package and portal expose the Jacobian and Fisher construction so that experimentalists can optimize bias, salinity, and observable combinations before fabricating or measuring a pore.</w:t>
+      </w:r>
+    </w:p>
+    <w:p/>
+    <w:p>
+      <w:r>
+        <w:t xml:space="preserve">9. </w:t>
+      </w:r>
+      <w:r>
+        <w:rPr>
+          <w:b/>
+        </w:rPr>
+        <w:t>A sensitivity-controlled hybrid solver and a bounded reversal-potential result.</w:t>
+      </w:r>
+      <w:r>
+        <w:t xml:space="preserve"> A Weyl-gated SG/FV correction preserves a median current error of </w:t>
       </w:r>
       <m:oMath xmlns:a="http://schemas.openxmlformats.org/drawingml/2006/main" xmlns:pic="http://schemas.openxmlformats.org/drawingml/2006/picture">
+        <m:r>
+          <m:t>1.9</m:t>
+        </m:r>
+        <m:r>
+          <m:t>i</m:t>
+        </m:r>
+        <m:r>
+          <m:t>m</m:t>
+        </m:r>
+        <m:r>
+          <m:t>e</m:t>
+        </m:r>
+        <m:r>
+          <m:t>s</m:t>
+        </m:r>
         <m:sSup>
           <m:e>
             <m:r>
@@ -930,13 +997,42 @@
           </m:e>
           <m:sup>
             <m:r>
-              <m:t>16</m:t>
+              <m:rPr>
+                <m:sty m:val="p"/>
+              </m:rPr>
+              <m:t>−</m:t>
+            </m:r>
+            <m:r>
+              <m:t>4</m:t>
             </m:r>
           </m:sup>
         </m:sSup>
       </m:oMath>
       <w:r>
-        <w:t>, while adding the near-wall selectivity observable reduces it by six to ten orders of magnitude. The released package and portal expose the Jacobian and Fisher construction so that experimentalists can optimize bias, salinity, and observable combinations before fabricating or measuring a pore.</w:t>
+        <w:t xml:space="preserve"> at 0.20 s per state, 7.6-fold below a full </w:t>
+      </w:r>
+      <m:oMath xmlns:a="http://schemas.openxmlformats.org/drawingml/2006/main" xmlns:pic="http://schemas.openxmlformats.org/drawingml/2006/picture">
+        <m:r>
+          <m:t>21</m:t>
+        </m:r>
+        <m:r>
+          <m:t>i</m:t>
+        </m:r>
+        <m:r>
+          <m:t>m</m:t>
+        </m:r>
+        <m:r>
+          <m:t>e</m:t>
+        </m:r>
+        <m:r>
+          <m:t>s</m:t>
+        </m:r>
+        <m:r>
+          <m:t>61</m:t>
+        </m:r>
+      </m:oMath>
+      <w:r>
+        <w:t xml:space="preserve"> solve, on a 120-state weak/transitional/strong benchmark. The same study generalizes the ansatz and solver to unequal reservoirs and solves the zero-current reversal potential, but the reversal-potential inverse remains charge-limited (16.9% at 1% noise), so we do not claim sub-percent charge recovery from that protocol and retain the dual-selectivity 4.8% result. Reporting this negative result is part of the identifiability contribution.</w:t>
       </w:r>
     </w:p>
     <w:p/>

</xml_diff>

<commit_message>
Stage 20: blind 2,700-realization inverse, reference-free controller, v1.6.0 release
</commit_message>
<xml_diff>
--- a/manuscript/Cover_Letter_CPC.docx
+++ b/manuscript/Cover_Letter_CPC.docx
@@ -537,7 +537,7 @@
         <w:t>An inverse-sensing demonstration and an identifiability result.</w:t>
       </w:r>
       <w:r>
-        <w:t xml:space="preserve"> A gradient-free inverse recovery runs roughly 3,200-fold faster than the finite-volume reference solver. A Fisher-information analysis and a 15-state, 20-realization study reveal a physical conductance identifiability boundary: dual current–plus–near-wall-selectivity inversion recovers the pore radius to 0.10% and the surface charge to 4.8%, whereas neither single-salt nor multi-salt current–voltage data resolve the charge. The negative-</w:t>
+        <w:t xml:space="preserve"> A gradient-free inverse recovery runs roughly 3,200-fold faster than the finite-volume reference solver. A Fisher-information analysis and a blind 2,700-realization study reveal a physical conductance identifiability boundary: dual current–plus–near-wall-selectivity inversion reaches 1.7% median charge error and 0.17% radius error, but only 68% 95% coverage at 1% noise because a roughly 2% surrogate bias floor remains; neither single-salt nor multi-salt current–voltage data resolve the charge. The negative-</w:t>
       </w:r>
       <m:oMath xmlns:a="http://schemas.openxmlformats.org/drawingml/2006/main" xmlns:pic="http://schemas.openxmlformats.org/drawingml/2006/picture">
         <m:sSub>
@@ -625,7 +625,7 @@
         </m:sSup>
       </m:oMath>
       <w:r>
-        <w:t>), with a 1%-noise CRLB of 0.37% for radius but 86 for charge. The contrast is a limitation of the measurement, not of the surrogate or solver.</w:t>
+        <w:t>), with a 1%-noise CRLB of 0.37% for radius but 86 for charge. The conductance-only contrast is a limitation of the measurement, not of the surrogate or solver.</w:t>
       </w:r>
     </w:p>
     <w:p/>
@@ -968,26 +968,20 @@
         <w:rPr>
           <w:b/>
         </w:rPr>
-        <w:t>A sensitivity-controlled hybrid solver and a bounded reversal-potential result.</w:t>
+        <w:t>A sensitivity-controlled hybrid solver and a blind inverse benchmark.</w:t>
       </w:r>
       <w:r>
-        <w:t xml:space="preserve"> A Weyl-gated SG/FV correction preserves a median current error of </w:t>
+        <w:t xml:space="preserve"> A reference-free Weyl-gated controller warm-starts the conservative SG/FV solve from the operator and reproduces the cold-solve current to </w:t>
       </w:r>
       <m:oMath xmlns:a="http://schemas.openxmlformats.org/drawingml/2006/main" xmlns:pic="http://schemas.openxmlformats.org/drawingml/2006/picture">
         <m:r>
-          <m:t>1.9</m:t>
+          <m:t>3</m:t>
         </m:r>
         <m:r>
-          <m:t>i</m:t>
-        </m:r>
-        <m:r>
-          <m:t>m</m:t>
-        </m:r>
-        <m:r>
-          <m:t>e</m:t>
-        </m:r>
-        <m:r>
-          <m:t>s</m:t>
+          <m:rPr>
+            <m:sty m:val="p"/>
+          </m:rPr>
+          <m:t>×</m:t>
         </m:r>
         <m:sSup>
           <m:e>
@@ -1003,36 +997,30 @@
               <m:t>−</m:t>
             </m:r>
             <m:r>
-              <m:t>4</m:t>
+              <m:t>12</m:t>
             </m:r>
           </m:sup>
         </m:sSup>
       </m:oMath>
       <w:r>
-        <w:t xml:space="preserve"> at 0.20 s per state, 7.6-fold below a full </w:t>
+        <w:t xml:space="preserve"> at 0.165 s per state, 9.5-fold below a full </w:t>
       </w:r>
       <m:oMath xmlns:a="http://schemas.openxmlformats.org/drawingml/2006/main" xmlns:pic="http://schemas.openxmlformats.org/drawingml/2006/picture">
         <m:r>
           <m:t>21</m:t>
         </m:r>
         <m:r>
-          <m:t>i</m:t>
-        </m:r>
-        <m:r>
-          <m:t>m</m:t>
-        </m:r>
-        <m:r>
-          <m:t>e</m:t>
-        </m:r>
-        <m:r>
-          <m:t>s</m:t>
+          <m:rPr>
+            <m:sty m:val="p"/>
+          </m:rPr>
+          <m:t>×</m:t>
         </m:r>
         <m:r>
           <m:t>61</m:t>
         </m:r>
       </m:oMath>
       <w:r>
-        <w:t xml:space="preserve"> solve, on a 120-state weak/transitional/strong benchmark. The same study generalizes the ansatz and solver to unequal reservoirs and solves the zero-current reversal potential, but the reversal-potential inverse remains charge-limited (16.9% at 1% noise), so we do not claim sub-percent charge recovery from that protocol and retain the dual-selectivity 4.8% result. Reporting this negative result is part of the identifiability contribution.</w:t>
+        <w:t xml:space="preserve"> solve, on a 120-state weak/transitional/strong benchmark. A 2,700-realization blind inverse study with shared noisy observations shows that the dual current-plus-selectivity protocol reaches 1.7% median charge error but only 68% 95% coverage at 1% noise, while the reversal potential is state dependent (263% weak-charge versus 7.3% strong-charge). We therefore report a bias-limited 2% recovery and a strong-exclusion 7% recovery, not calibrated sub-percent charge identification.</w:t>
       </w:r>
     </w:p>
     <w:p/>

</xml_diff>

<commit_message>
Stage 21B: verified 675-realization inverse rerun and D1/D2/D3 bias diagnostic
- Replace all inverse numbers with values recomputed from the 675 real records
- Extend S22 with R/sigma coverage and the D1/D2/D3 bias rows
- Show the ~1.3% floor is cross-grid mesh bias (D1 = 2e-7, D2 = 1.29%)
- Regenerate Figure 6D directly from the records; update wording to 5 reps
- Rebuild packages and pass all 37 audit checks
</commit_message>
<xml_diff>
--- a/manuscript/Cover_Letter_CPC.docx
+++ b/manuscript/Cover_Letter_CPC.docx
@@ -537,7 +537,7 @@
         <w:t>An inverse-sensing demonstration and an identifiability result.</w:t>
       </w:r>
       <w:r>
-        <w:t xml:space="preserve"> A gradient-free inverse recovery runs roughly 3,200-fold faster than the finite-volume reference solver. A Fisher-information analysis and a blind 2,700-realization study reveal a physical conductance identifiability boundary: dual current–plus–near-wall-selectivity inversion reaches 1.7% median charge error and 0.17% radius error, but only 68% 95% coverage at 1% noise because a roughly 2% surrogate bias floor remains; neither single-salt nor multi-salt current–voltage data resolve the charge. The negative-</w:t>
+        <w:t xml:space="preserve"> A gradient-free inverse recovery runs roughly 3,200-fold faster than the finite-volume reference solver. A Fisher-information analysis and a blind 675-realization study reveal a physical conductance identifiability boundary: dual current–plus–near-wall-selectivity inversion reaches 1.5% median charge error and 0.15% radius error, but only 73% 95% coverage at 1% noise because a roughly 1.3% mesh-discretization bias remains; neither single-salt nor multi-salt current–voltage data resolve the charge. The negative-</w:t>
       </w:r>
       <m:oMath xmlns:a="http://schemas.openxmlformats.org/drawingml/2006/main" xmlns:pic="http://schemas.openxmlformats.org/drawingml/2006/picture">
         <m:sSub>
@@ -1003,7 +1003,7 @@
         </m:sSup>
       </m:oMath>
       <w:r>
-        <w:t xml:space="preserve"> at 0.165 s per state, 9.5-fold below a full </w:t>
+        <w:t xml:space="preserve"> at 0.153 s per state, 1.54-fold below a full </w:t>
       </w:r>
       <m:oMath xmlns:a="http://schemas.openxmlformats.org/drawingml/2006/main" xmlns:pic="http://schemas.openxmlformats.org/drawingml/2006/picture">
         <m:r>
@@ -1020,7 +1020,7 @@
         </m:r>
       </m:oMath>
       <w:r>
-        <w:t xml:space="preserve"> solve, on a 120-state weak/transitional/strong benchmark. A 2,700-realization blind inverse study with shared noisy observations shows that the dual current-plus-selectivity protocol reaches 1.7% median charge error but only 68% 95% coverage at 1% noise, while the reversal potential is state dependent (263% weak-charge versus 7.3% strong-charge). We therefore report a bias-limited 2% recovery and a strong-exclusion 7% recovery, not calibrated sub-percent charge identification.</w:t>
+        <w:t xml:space="preserve"> solve, on a 120-state weak/transitional/strong benchmark. A 675-realization blind inverse study with shared noisy observations shows that the dual current-plus-selectivity protocol reaches 1.5% median charge error but only 73% 95% coverage at 1% noise, while the reversal potential is state dependent (85% weak-charge versus 5.0% strong-charge). We therefore report a bias-limited 1.5% recovery and a strong-exclusion 5% recovery, not calibrated sub-percent charge identification.</w:t>
       </w:r>
     </w:p>
     <w:p/>

</xml_diff>

<commit_message>
Stage 21B: report inverse convergence failures and fix reviewer inconsistencies
- Add B/C convergence and boundary-hit rates to Table S22; state that all fits
  are included and that non-converged intervals are provisional local intervals
- Explain single-salt line-search failures and stop reasons; rely on Fisher for
  identifiability rather than failed optimization
- Split Task A (forward) and Task B (reversal root) timing/error tables and use
  same-experiment 5.08e-14 current error
- Correct COMPHY-D-26-00857 status/relationship in manuscript and cover letter
- Fix 1.3% low-noise coverage, S7 realization counts, single-start C, 0.00736 s
  one-step time, kappa range, 99.1% rendering, and Figure 6 state count
- Rewrite cover letter to three contributions and disclose the prior submission
- Track the 675 per-realization inverse records in the repository
</commit_message>
<xml_diff>
--- a/manuscript/Cover_Letter_CPC.docx
+++ b/manuscript/Cover_Letter_CPC.docx
@@ -19,7 +19,7 @@
         <w:t>Date:</w:t>
       </w:r>
       <w:r>
-        <w:t xml:space="preserve"> 21 October 2026</w:t>
+        <w:t xml:space="preserve"> 23 October 2026</w:t>
       </w:r>
     </w:p>
     <w:p/>
@@ -111,37 +111,34 @@
     <w:p/>
     <w:p>
       <w:r>
-        <w:t xml:space="preserve">This work is a natural fit for </w:t>
+        <w:rPr>
+          <w:b/>
+        </w:rPr>
+        <w:t>Relationship to COMPHY-D-26-00857.</w:t>
+      </w:r>
+      <w:r>
+        <w:t xml:space="preserve"> An earlier manuscript by the same author, </w:t>
       </w:r>
       <w:r>
         <w:rPr>
           <w:i/>
         </w:rPr>
-        <w:t>Computer Physics Communications</w:t>
+        <w:t>"Exact-boundary data-assimilated physics-informed neural networks for coupled Poisson--Nernst--Planck transport at charged nanopore biointerfaces"</w:t>
       </w:r>
       <w:r>
-        <w:t xml:space="preserve"> because its primary deliverable is a reusable, documented, and reproducible computational package. The submission includes a CPC Program Summary, an MIT-licensed public repository, trained PyTorch and ONNX models, a serverless browser simulator, and a full reproducibility package with archived result files. The study is framed explicitly as a computational-physics instrument: its contribution is the elimination of per-state retraining for design, uncertainty-quantification, and inverse workflows, not a claim of superiority over specialized solvers.</w:t>
+        <w:t>, was submitted to Computer Physics Communications as COMPHY-D-26-00857 (revision R1); it has not been published. That study is fixed-state: one network is trained for one operating point and needs about 500 s per new state. The present manuscript is a separate, related study. It reuses the verified SG/FV reference and the DA-PINN benchmark comparison, but its new contributions are the parameter-conditioned operator, the charge-balanced exact-boundary reparameterization with its controlled ablation, and the identifiability analysis with the blind inverse and warm-started solver benchmark. Shared methods and benchmark material are identified explicitly in the manuscript.</w:t>
       </w:r>
     </w:p>
     <w:p/>
     <w:p>
       <w:r>
-        <w:t>This work advances decisively beyond my prior fixed-state deep-adaptive PINN study (submitted as COMPHY-D-26-00857), which solved the axisymmetric Poisson–Nernst–Planck (PNP) system for a single operating point at a time and required roughly 500 s of retraining per new state. The present manuscript replaces that per-state workflow with a single parameter-conditioned neural operator, and it contributes the following.</w:t>
-      </w:r>
-    </w:p>
-    <w:p/>
-    <w:p>
-      <w:r>
-        <w:t xml:space="preserve">1. </w:t>
-      </w:r>
-      <w:r>
         <w:rPr>
           <w:b/>
         </w:rPr>
-        <w:t>A 4D parameter-conditioned operator.</w:t>
+        <w:t>Contributions.</w:t>
       </w:r>
       <w:r>
-        <w:t xml:space="preserve"> A multi-scale radial physics-informed DeepONet maps the four physical parameters </w:t>
+        <w:t xml:space="preserve"> (i) A single multi-scale radial physics-informed DeepONet maps the four parameters </w:t>
       </w:r>
       <m:oMath xmlns:a="http://schemas.openxmlformats.org/drawingml/2006/main" xmlns:pic="http://schemas.openxmlformats.org/drawingml/2006/picture">
         <m:r>
@@ -219,526 +216,28 @@
         </m:r>
       </m:oMath>
       <w:r>
-        <w:t xml:space="preserve"> directly to the coupled potential and ionic-concentration fields, eliminating the ~500 s per-state retraining bottleneck of the prior DA-PINN and enabling instant querying of the whole parameter family from a single trained model.</w:t>
-      </w:r>
-    </w:p>
-    <w:p/>
-    <w:p>
-      <w:r>
-        <w:t xml:space="preserve">2. </w:t>
-      </w:r>
-      <w:r>
-        <w:rPr>
-          <w:b/>
-        </w:rPr>
-        <w:t>An exact-boundary, charge-balanced reparameterization.</w:t>
-      </w:r>
-      <w:r>
-        <w:t xml:space="preserve"> The ansatz predicts a positive concentration sum </w:t>
+        <w:t xml:space="preserve"> to the coupled potential and ionic concentrations, with exact reservoir boundary conditions and a charge-balanced hyperbolic reconstruction that removes subtractive cancellation in net charge. On held-out states it reaches 0.00089 potential and 0.00109 current relative </w:t>
       </w:r>
       <m:oMath xmlns:a="http://schemas.openxmlformats.org/drawingml/2006/main" xmlns:pic="http://schemas.openxmlformats.org/drawingml/2006/picture">
-        <m:r>
-          <m:t>s</m:t>
-        </m:r>
-      </m:oMath>
-      <w:r>
-        <w:t xml:space="preserve"> and a net charge </w:t>
-      </w:r>
-      <m:oMath xmlns:a="http://schemas.openxmlformats.org/drawingml/2006/main" xmlns:pic="http://schemas.openxmlformats.org/drawingml/2006/picture">
-        <m:r>
-          <m:t>ρ</m:t>
-        </m:r>
-      </m:oMath>
-      <w:r>
-        <w:t xml:space="preserve">, with the exponential envelope </w:t>
-      </w:r>
-      <m:oMath xmlns:a="http://schemas.openxmlformats.org/drawingml/2006/main" xmlns:pic="http://schemas.openxmlformats.org/drawingml/2006/picture">
-        <m:r>
-          <m:t>s</m:t>
-        </m:r>
-        <m:r>
-          <m:rPr>
-            <m:sty m:val="p"/>
-          </m:rPr>
-          <m:t>=</m:t>
-        </m:r>
-        <m:r>
-          <m:t>2</m:t>
-        </m:r>
-        <m:r>
-          <m:rPr>
-            <m:sty m:val="p"/>
-          </m:rPr>
-          <m:t>exp</m:t>
-        </m:r>
-        <m:r>
-          <m:rPr>
-            <m:sty m:val="p"/>
-          </m:rPr>
-          <m:t>(</m:t>
-        </m:r>
-        <m:r>
-          <m:rPr>
-            <m:sty m:val="p"/>
-          </m:rPr>
-          <m:t>c</m:t>
-        </m:r>
-        <m:r>
-          <m:rPr>
-            <m:sty m:val="p"/>
-          </m:rPr>
-          <m:t>l</m:t>
-        </m:r>
-        <m:r>
-          <m:rPr>
-            <m:sty m:val="p"/>
-          </m:rPr>
-          <m:t>i</m:t>
-        </m:r>
-        <m:r>
-          <m:rPr>
-            <m:sty m:val="p"/>
-          </m:rPr>
-          <m:t>p</m:t>
-        </m:r>
-        <m:r>
-          <m:rPr>
-            <m:sty m:val="p"/>
-          </m:rPr>
-          <m:t>(</m:t>
-        </m:r>
-        <m:r>
-          <m:t>z</m:t>
-        </m:r>
-        <m:r>
-          <m:rPr>
-            <m:sty m:val="p"/>
-          </m:rPr>
-          <m:t>(</m:t>
-        </m:r>
-        <m:r>
-          <m:t>1</m:t>
-        </m:r>
-        <m:r>
-          <m:rPr>
-            <m:sty m:val="p"/>
-          </m:rPr>
-          <m:t>−</m:t>
-        </m:r>
-        <m:r>
-          <m:t>z</m:t>
-        </m:r>
-        <m:r>
-          <m:rPr>
-            <m:sty m:val="p"/>
-          </m:rPr>
-          <m:t>)</m:t>
-        </m:r>
         <m:sSub>
           <m:e>
             <m:r>
-              <m:t>G</m:t>
+              <m:t>L</m:t>
             </m:r>
           </m:e>
           <m:sub>
             <m:r>
-              <m:t>s</m:t>
-            </m:r>
-          </m:sub>
-        </m:sSub>
-        <m:r>
-          <m:rPr>
-            <m:sty m:val="p"/>
-          </m:rPr>
-          <m:t>)</m:t>
-        </m:r>
-        <m:r>
-          <m:rPr>
-            <m:sty m:val="p"/>
-          </m:rPr>
-          <m:t>)</m:t>
-        </m:r>
-      </m:oMath>
-      <w:r>
-        <w:t xml:space="preserve"> and </w:t>
-      </w:r>
-      <m:oMath xmlns:a="http://schemas.openxmlformats.org/drawingml/2006/main" xmlns:pic="http://schemas.openxmlformats.org/drawingml/2006/picture">
-        <m:r>
-          <m:t>ρ</m:t>
-        </m:r>
-        <m:r>
-          <m:rPr>
-            <m:sty m:val="p"/>
-          </m:rPr>
-          <m:t>=</m:t>
-        </m:r>
-        <m:r>
-          <m:t>z</m:t>
-        </m:r>
-        <m:r>
-          <m:rPr>
-            <m:sty m:val="p"/>
-          </m:rPr>
-          <m:t>(</m:t>
-        </m:r>
-        <m:r>
-          <m:t>1</m:t>
-        </m:r>
-        <m:r>
-          <m:rPr>
-            <m:sty m:val="p"/>
-          </m:rPr>
-          <m:t>−</m:t>
-        </m:r>
-        <m:r>
-          <m:t>z</m:t>
-        </m:r>
-        <m:r>
-          <m:rPr>
-            <m:sty m:val="p"/>
-          </m:rPr>
-          <m:t>)</m:t>
-        </m:r>
-        <m:sSub>
-          <m:e>
-            <m:r>
-              <m:t>G</m:t>
-            </m:r>
-          </m:e>
-          <m:sub>
-            <m:r>
-              <m:t>ρ</m:t>
+              <m:t>2</m:t>
             </m:r>
           </m:sub>
         </m:sSub>
       </m:oMath>
       <w:r>
-        <w:t xml:space="preserve">, and reconstructs physical concentrations through the hyperbolic identity </w:t>
-      </w:r>
-      <m:oMath xmlns:a="http://schemas.openxmlformats.org/drawingml/2006/main" xmlns:pic="http://schemas.openxmlformats.org/drawingml/2006/picture">
-        <m:sSub>
-          <m:e>
-            <m:r>
-              <m:t>c</m:t>
-            </m:r>
-          </m:e>
-          <m:sub>
-            <m:r>
-              <m:rPr>
-                <m:sty m:val="p"/>
-              </m:rPr>
-              <m:t>±</m:t>
-            </m:r>
-          </m:sub>
-        </m:sSub>
-        <m:r>
-          <m:rPr>
-            <m:sty m:val="p"/>
-          </m:rPr>
-          <m:t>=</m:t>
-        </m:r>
-        <m:r>
-          <m:rPr>
-            <m:sty m:val="p"/>
-          </m:rPr>
-          <m:t>(</m:t>
-        </m:r>
-        <m:rad>
-          <m:radPr>
-            <m:degHide m:val="on"/>
-          </m:radPr>
-          <m:deg/>
-          <m:e>
-            <m:sSup>
-              <m:e>
-                <m:r>
-                  <m:t>s</m:t>
-                </m:r>
-              </m:e>
-              <m:sup>
-                <m:r>
-                  <m:t>2</m:t>
-                </m:r>
-              </m:sup>
-            </m:sSup>
-            <m:r>
-              <m:rPr>
-                <m:sty m:val="p"/>
-              </m:rPr>
-              <m:t>+</m:t>
-            </m:r>
-            <m:sSup>
-              <m:e>
-                <m:r>
-                  <m:t>ρ</m:t>
-                </m:r>
-              </m:e>
-              <m:sup>
-                <m:r>
-                  <m:t>2</m:t>
-                </m:r>
-              </m:sup>
-            </m:sSup>
-          </m:e>
-        </m:rad>
-        <m:r>
-          <m:rPr>
-            <m:sty m:val="p"/>
-          </m:rPr>
-          <m:t>±</m:t>
-        </m:r>
-        <m:r>
-          <m:t>ρ</m:t>
-        </m:r>
-        <m:r>
-          <m:rPr>
-            <m:sty m:val="p"/>
-          </m:rPr>
-          <m:t>)</m:t>
-        </m:r>
-        <m:r>
-          <m:rPr>
-            <m:sty m:val="p"/>
-          </m:rPr>
-          <m:t>/</m:t>
-        </m:r>
-        <m:r>
-          <m:t>2</m:t>
-        </m:r>
-      </m:oMath>
-      <w:r>
-        <w:t>. This enforces the reservoir boundary conditions exactly and removes the subtractive cancellation that limits net-charge accuracy, reducing net-charge error 8.63-fold (DeepONet) and 10.29-fold (FNO) relative to a naive direct-concentration output; against a fairly trained direct loss, the improvement is 13% net charge and 18% current.</w:t>
-      </w:r>
-    </w:p>
-    <w:p/>
-    <w:p>
-      <w:r>
-        <w:t xml:space="preserve">3. </w:t>
-      </w:r>
-      <w:r>
-        <w:rPr>
-          <w:b/>
-        </w:rPr>
-        <w:t>A head-to-head operator comparison.</w:t>
-      </w:r>
-      <w:r>
-        <w:t xml:space="preserve"> The multi-scale radial PI-DeepONet (36,880 parameters, 0.072 ms ONNX latency) is benchmarked against a four-layer real-DFT Fourier neural operator with 12.5-fold more parameters (460,488), across both in-distribution and out-of-distribution Debye-overlap regimes. The DeepONet is 6.16-fold more accurate in potential and 7.79-fold more accurate in current in-distribution, while the FNO is better for net charge and cation concentration out of distribution, isolating where each architecture succeeds.</w:t>
-      </w:r>
-    </w:p>
-    <w:p/>
-    <w:p>
-      <w:r>
-        <w:t xml:space="preserve">4. </w:t>
-      </w:r>
-      <w:r>
-        <w:rPr>
-          <w:b/>
-        </w:rPr>
-        <w:t>An inverse-sensing demonstration and an identifiability result.</w:t>
-      </w:r>
-      <w:r>
-        <w:t xml:space="preserve"> A gradient-free inverse recovery runs roughly 3,200-fold faster than the finite-volume reference solver. A Fisher-information analysis and a blind 675-realization study reveal a physical conductance identifiability boundary: dual current–plus–near-wall-selectivity inversion reaches 1.5% median charge error and 0.15% radius error, but only 73% 95% coverage at 1% noise because a roughly 1.3% mesh-discretization bias remains; neither single-salt nor multi-salt current–voltage data resolve the charge. The negative-</w:t>
-      </w:r>
-      <m:oMath xmlns:a="http://schemas.openxmlformats.org/drawingml/2006/main" xmlns:pic="http://schemas.openxmlformats.org/drawingml/2006/picture">
-        <m:sSub>
-          <m:e>
-            <m:r>
-              <m:t>q</m:t>
-            </m:r>
-          </m:e>
-          <m:sub>
-            <m:r>
-              <m:t>w</m:t>
-            </m:r>
-          </m:sub>
-        </m:sSub>
-      </m:oMath>
-      <w:r>
-        <w:t xml:space="preserve"> Fisher plane is ill-conditioned (median </w:t>
+        <w:t xml:space="preserve"> error and runs in 0.072 ms per state after ONNX export. (ii) A Fisher-information analysis, validated against exact float64 SG/FV Jacobians, shows that a conductance-only measurement leaves wall charge practically unidentifiable for symmetric electrolytes with nearly equal diffusivities. A blind 675-realization study with exact SG/FV observations confirms the limit and shows that a dual current-plus-near-wall-selectivity protocol reaches 1.5% median charge error, but with 73% 95% coverage at 1% noise dominated by a 1.3% cross-grid discretization bias; single-salt fits do not converge, so their intervals are reported as provisional local intervals. (iii) A reference-free warm-started SG/FV solver reproduces the cold-solve current to </w:t>
       </w:r>
       <m:oMath xmlns:a="http://schemas.openxmlformats.org/drawingml/2006/main" xmlns:pic="http://schemas.openxmlformats.org/drawingml/2006/picture">
         <m:r>
-          <m:t>κ</m:t>
-        </m:r>
-        <m:r>
-          <m:rPr>
-            <m:sty m:val="p"/>
-          </m:rPr>
-          <m:t>(</m:t>
-        </m:r>
-        <m:r>
-          <m:rPr>
-            <m:scr m:val="script"/>
-            <m:sty m:val="p"/>
-          </m:rPr>
-          <m:t>F</m:t>
-        </m:r>
-        <m:r>
-          <m:rPr>
-            <m:sty m:val="p"/>
-          </m:rPr>
-          <m:t>)</m:t>
-        </m:r>
-        <m:r>
-          <m:rPr>
-            <m:sty m:val="p"/>
-          </m:rPr>
-          <m:t>=</m:t>
-        </m:r>
-        <m:r>
-          <m:t>1.2</m:t>
-        </m:r>
-        <m:r>
-          <m:rPr>
-            <m:sty m:val="p"/>
-          </m:rPr>
-          <m:t>×</m:t>
-        </m:r>
-        <m:sSup>
-          <m:e>
-            <m:r>
-              <m:t>10</m:t>
-            </m:r>
-          </m:e>
-          <m:sup>
-            <m:r>
-              <m:t>9</m:t>
-            </m:r>
-          </m:sup>
-        </m:sSup>
-      </m:oMath>
-      <w:r>
-        <w:t xml:space="preserve">; 99.1% above </w:t>
-      </w:r>
-      <m:oMath xmlns:a="http://schemas.openxmlformats.org/drawingml/2006/main" xmlns:pic="http://schemas.openxmlformats.org/drawingml/2006/picture">
-        <m:sSup>
-          <m:e>
-            <m:r>
-              <m:t>10</m:t>
-            </m:r>
-          </m:e>
-          <m:sup>
-            <m:r>
-              <m:t>8</m:t>
-            </m:r>
-          </m:sup>
-        </m:sSup>
-      </m:oMath>
-      <w:r>
-        <w:t>), with a 1%-noise CRLB of 0.37% for radius but 86 for charge. The conductance-only contrast is a limitation of the measurement, not of the surrogate or solver.</w:t>
-      </w:r>
-    </w:p>
-    <w:p/>
-    <w:p>
-      <w:r>
-        <w:t xml:space="preserve">5. </w:t>
-      </w:r>
-      <w:r>
-        <w:rPr>
-          <w:b/>
-        </w:rPr>
-        <w:t>Scope-bounding ablations.</w:t>
-      </w:r>
-      <w:r>
-        <w:t xml:space="preserve"> A trunk ablation at matched capacity shows that the multi-scale radial basis is a modest near-wall inductive bias rather than a necessity (about 7% lower wall-gradient error, no bulk-accuracy advantage), and a nested 384-state study gives an in-distribution data-scaling exponent of 0.55 close to the expected N^−1/2, while out-of-distribution error is nearly data-insensitive; a spatial decomposition shows that the residual OOD error is concentrated in the wall EDL and reservoir transitions but cancels in the integrated current.</w:t>
-      </w:r>
-    </w:p>
-    <w:p/>
-    <w:p>
-      <w:r>
-        <w:t xml:space="preserve">6. </w:t>
-      </w:r>
-      <w:r>
-        <w:rPr>
-          <w:b/>
-        </w:rPr>
-        <w:t>Reproducibility and an interactive tool.</w:t>
-      </w:r>
-      <w:r>
-        <w:t xml:space="preserve"> A verified 240-state benchmark plus a 384-state scaling expansion, trained seed-42 models in PyTorch and ONNX, archived result files, a serverless browser simulator, and an MIT-licensed reproducibility package accompany the manuscript. Every number in the paper is traceable to an archived artifact.</w:t>
-      </w:r>
-    </w:p>
-    <w:p/>
-    <w:p>
-      <w:r>
-        <w:t xml:space="preserve">7. </w:t>
-      </w:r>
-      <w:r>
-        <w:rPr>
-          <w:b/>
-        </w:rPr>
-        <w:t>A four-way constraint benchmark and an exact Jacobian validation.</w:t>
-      </w:r>
-      <w:r>
-        <w:t xml:space="preserve"> Under an identical PI-DeepONet backbone and three seeds, the hyperbolic reparameterization matches the best projection scheme in accuracy while keeping the charge identity exact to machine precision, and a physics-weight sweep identifies </w:t>
-      </w:r>
-      <m:oMath xmlns:a="http://schemas.openxmlformats.org/drawingml/2006/main" xmlns:pic="http://schemas.openxmlformats.org/drawingml/2006/picture">
-        <m:sSup>
-          <m:e>
-            <m:r>
-              <m:t>10</m:t>
-            </m:r>
-          </m:e>
-          <m:sup>
-            <m:r>
-              <m:rPr>
-                <m:sty m:val="p"/>
-              </m:rPr>
-              <m:t>−</m:t>
-            </m:r>
-            <m:r>
-              <m:t>3</m:t>
-            </m:r>
-          </m:sup>
-        </m:sSup>
-      </m:oMath>
-      <w:r>
-        <w:t xml:space="preserve"> as the Pareto point. A centered finite-difference Jacobian of the float64 SG/FV solver validates the operator's Fisher analysis: the two agree on </w:t>
-      </w:r>
-      <m:oMath xmlns:a="http://schemas.openxmlformats.org/drawingml/2006/main" xmlns:pic="http://schemas.openxmlformats.org/drawingml/2006/picture">
-        <m:r>
-          <m:rPr>
-            <m:sty m:val="p"/>
-          </m:rPr>
-          <m:t>∂</m:t>
-        </m:r>
-        <m:r>
-          <m:rPr>
-            <m:sty m:val="p"/>
-          </m:rPr>
-          <m:t>ln</m:t>
-        </m:r>
-        <m:r>
-          <m:t>I</m:t>
-        </m:r>
-        <m:r>
-          <m:rPr>
-            <m:sty m:val="p"/>
-          </m:rPr>
-          <m:t>/</m:t>
-        </m:r>
-        <m:r>
-          <m:rPr>
-            <m:sty m:val="p"/>
-          </m:rPr>
-          <m:t>∂</m:t>
-        </m:r>
-        <m:r>
-          <m:rPr>
-            <m:sty m:val="p"/>
-          </m:rPr>
-          <m:t>ln</m:t>
-        </m:r>
-        <m:r>
-          <m:t>R</m:t>
-        </m:r>
-      </m:oMath>
-      <w:r>
-        <w:t xml:space="preserve"> to </w:t>
-      </w:r>
-      <m:oMath xmlns:a="http://schemas.openxmlformats.org/drawingml/2006/main" xmlns:pic="http://schemas.openxmlformats.org/drawingml/2006/picture">
-        <m:r>
-          <m:t>1.1</m:t>
+          <m:t>5</m:t>
         </m:r>
         <m:r>
           <m:rPr>
@@ -760,267 +259,35 @@
               <m:t>−</m:t>
             </m:r>
             <m:r>
-              <m:t>4</m:t>
+              <m:t>14</m:t>
             </m:r>
           </m:sup>
         </m:sSup>
       </m:oMath>
       <w:r>
-        <w:t>, while both show a near-null single-salt charge direction that the near-wall selectivity observable resolves.</w:t>
-      </w:r>
-    </w:p>
-    <w:p/>
-    <w:p>
-      <w:r>
-        <w:t xml:space="preserve">8. </w:t>
-      </w:r>
-      <w:r>
-        <w:rPr>
-          <w:b/>
-        </w:rPr>
-        <w:t>A diffusivity-asymmetry proof and a protocol-design workflow.</w:t>
-      </w:r>
-      <w:r>
-        <w:t xml:space="preserve"> We show analytically that the local ohmic coefficient is </w:t>
+        <w:t xml:space="preserve"> at 0.153 s (1.54</w:t>
       </w:r>
       <m:oMath xmlns:a="http://schemas.openxmlformats.org/drawingml/2006/main" xmlns:pic="http://schemas.openxmlformats.org/drawingml/2006/picture">
-        <m:acc>
-          <m:accPr>
-            <m:chr m:val="‾"/>
-          </m:accPr>
-          <m:e>
-            <m:r>
-              <m:t>D</m:t>
-            </m:r>
-          </m:e>
-        </m:acc>
-        <m:rad>
-          <m:radPr>
-            <m:degHide m:val="on"/>
-          </m:radPr>
-          <m:deg/>
-          <m:e>
-            <m:sSup>
-              <m:e>
-                <m:r>
-                  <m:t>s</m:t>
-                </m:r>
-              </m:e>
-              <m:sup>
-                <m:r>
-                  <m:t>2</m:t>
-                </m:r>
-              </m:sup>
-            </m:sSup>
-            <m:r>
-              <m:rPr>
-                <m:sty m:val="p"/>
-              </m:rPr>
-              <m:t>+</m:t>
-            </m:r>
-            <m:sSup>
-              <m:e>
-                <m:r>
-                  <m:t>ρ</m:t>
-                </m:r>
-              </m:e>
-              <m:sup>
-                <m:r>
-                  <m:t>2</m:t>
-                </m:r>
-              </m:sup>
-            </m:sSup>
-          </m:e>
-        </m:rad>
-        <m:r>
-          <m:rPr>
-            <m:sty m:val="p"/>
-          </m:rPr>
-          <m:t>+</m:t>
-        </m:r>
-        <m:f>
-          <m:fPr>
-            <m:type m:val="lin"/>
-          </m:fPr>
-          <m:num>
-            <m:r>
-              <m:t>1</m:t>
-            </m:r>
-          </m:num>
-          <m:den>
-            <m:r>
-              <m:t>2</m:t>
-            </m:r>
-          </m:den>
-        </m:f>
-        <m:r>
-          <m:rPr>
-            <m:sty m:val="p"/>
-          </m:rPr>
-          <m:t>(</m:t>
-        </m:r>
-        <m:sSub>
-          <m:e>
-            <m:r>
-              <m:t>D</m:t>
-            </m:r>
-          </m:e>
-          <m:sub>
-            <m:r>
-              <m:rPr>
-                <m:sty m:val="p"/>
-              </m:rPr>
-              <m:t>+</m:t>
-            </m:r>
-          </m:sub>
-        </m:sSub>
-        <m:r>
-          <m:rPr>
-            <m:sty m:val="p"/>
-          </m:rPr>
-          <m:t>−</m:t>
-        </m:r>
-        <m:sSub>
-          <m:e>
-            <m:r>
-              <m:t>D</m:t>
-            </m:r>
-          </m:e>
-          <m:sub>
-            <m:r>
-              <m:rPr>
-                <m:sty m:val="p"/>
-              </m:rPr>
-              <m:t>−</m:t>
-            </m:r>
-          </m:sub>
-        </m:sSub>
-        <m:r>
-          <m:rPr>
-            <m:sty m:val="p"/>
-          </m:rPr>
-          <m:t>)</m:t>
-        </m:r>
-        <m:r>
-          <m:t>ρ</m:t>
-        </m:r>
-      </m:oMath>
-      <w:r>
-        <w:t>, so equal diffusivities leave only a second-order charge term, and verify with the exact float64 SG/FV solver at four diffusivity ratios (</w:t>
-      </w:r>
-      <m:oMath xmlns:a="http://schemas.openxmlformats.org/drawingml/2006/main" xmlns:pic="http://schemas.openxmlformats.org/drawingml/2006/picture">
-        <m:sSub>
-          <m:e>
-            <m:r>
-              <m:t>D</m:t>
-            </m:r>
-          </m:e>
-          <m:sub>
-            <m:r>
-              <m:rPr>
-                <m:sty m:val="p"/>
-              </m:rPr>
-              <m:t>+</m:t>
-            </m:r>
-          </m:sub>
-        </m:sSub>
-        <m:r>
-          <m:rPr>
-            <m:sty m:val="p"/>
-          </m:rPr>
-          <m:t>/</m:t>
-        </m:r>
-        <m:sSub>
-          <m:e>
-            <m:r>
-              <m:t>D</m:t>
-            </m:r>
-          </m:e>
-          <m:sub>
-            <m:r>
-              <m:rPr>
-                <m:sty m:val="p"/>
-              </m:rPr>
-              <m:t>−</m:t>
-            </m:r>
-          </m:sub>
-        </m:sSub>
-        <m:r>
-          <m:rPr>
-            <m:sty m:val="p"/>
-          </m:rPr>
-          <m:t>=</m:t>
-        </m:r>
-        <m:r>
-          <m:t>1.0</m:t>
-        </m:r>
-      </m:oMath>
-      <w:r>
-        <w:t>, 0.966, 0.655, 0.20) and two salinities. Even NaCl leaves the single-salt charge direction poorly conditioned, while adding the near-wall selectivity observable breaks the degeneracy. The released package and portal expose the Jacobian and Fisher construction so that experimentalists can optimize bias, salinity, and observable combinations before fabricating or measuring a pore.</w:t>
-      </w:r>
-    </w:p>
-    <w:p/>
-    <w:p>
-      <w:r>
-        <w:t xml:space="preserve">9. </w:t>
-      </w:r>
-      <w:r>
-        <w:rPr>
-          <w:b/>
-        </w:rPr>
-        <w:t>A sensitivity-controlled hybrid solver and a blind inverse benchmark.</w:t>
-      </w:r>
-      <w:r>
-        <w:t xml:space="preserve"> A reference-free Weyl-gated controller warm-starts the conservative SG/FV solve from the operator and reproduces the cold-solve current to </w:t>
-      </w:r>
-      <m:oMath xmlns:a="http://schemas.openxmlformats.org/drawingml/2006/main" xmlns:pic="http://schemas.openxmlformats.org/drawingml/2006/picture">
-        <m:r>
-          <m:t>3</m:t>
-        </m:r>
         <m:r>
           <m:rPr>
             <m:sty m:val="p"/>
           </m:rPr>
           <m:t>×</m:t>
         </m:r>
-        <m:sSup>
-          <m:e>
-            <m:r>
-              <m:t>10</m:t>
-            </m:r>
-          </m:e>
-          <m:sup>
-            <m:r>
-              <m:rPr>
-                <m:sty m:val="p"/>
-              </m:rPr>
-              <m:t>−</m:t>
-            </m:r>
-            <m:r>
-              <m:t>12</m:t>
-            </m:r>
-          </m:sup>
-        </m:sSup>
       </m:oMath>
       <w:r>
-        <w:t xml:space="preserve"> at 0.153 s per state, 1.54-fold below a full </w:t>
+        <w:t xml:space="preserve"> faster than a cold forward solve), and a warm-started reversal root is 1.19</w:t>
       </w:r>
       <m:oMath xmlns:a="http://schemas.openxmlformats.org/drawingml/2006/main" xmlns:pic="http://schemas.openxmlformats.org/drawingml/2006/picture">
-        <m:r>
-          <m:t>21</m:t>
-        </m:r>
         <m:r>
           <m:rPr>
             <m:sty m:val="p"/>
           </m:rPr>
           <m:t>×</m:t>
         </m:r>
-        <m:r>
-          <m:t>61</m:t>
-        </m:r>
       </m:oMath>
       <w:r>
-        <w:t xml:space="preserve"> solve, on a 120-state weak/transitional/strong benchmark. A 675-realization blind inverse study with shared noisy observations shows that the dual current-plus-selectivity protocol reaches 1.5% median charge error but only 73% 95% coverage at 1% noise, while the reversal potential is state dependent (85% weak-charge versus 5.0% strong-charge). We therefore report a bias-limited 1.5% recovery and a strong-exclusion 5% recovery, not calibrated sub-percent charge identification.</w:t>
+        <w:t xml:space="preserve"> faster than cold Brent. The 240-state benchmark, exact Jacobians, 120-case timing file, browser simulator, and MIT-licensed archive are included.</w:t>
       </w:r>
     </w:p>
     <w:p/>
@@ -1038,37 +305,7 @@
         <w:t>Data and code availability.</w:t>
       </w:r>
       <w:r>
-        <w:t xml:space="preserve"> The reproducibility package is available at https://github.com/Javad-Alizargar/nanopore-pino-surrogate under the MIT License, and the interactive simulator is hosted at https://pino.statwhy.com/. The permanently archived release is available at Zenodo DOI: 10.5281/zenodo.23487404. The repository and archive contain a comprehensive </w:t>
-      </w:r>
-      <w:r>
-        <w:rPr>
-          <w:rFonts w:ascii="Consolas" w:hAnsi="Consolas"/>
-          <w:sz w:val="19"/>
-        </w:rPr>
-        <w:t>README.md</w:t>
-      </w:r>
-      <w:r>
-        <w:t xml:space="preserve"> covering all files, installation, and execution, together with complete sample test-run input and output files in </w:t>
-      </w:r>
-      <w:r>
-        <w:rPr>
-          <w:rFonts w:ascii="Consolas" w:hAnsi="Consolas"/>
-          <w:sz w:val="19"/>
-        </w:rPr>
-        <w:t>test_run/</w:t>
-      </w:r>
-      <w:r>
-        <w:t xml:space="preserve">; </w:t>
-      </w:r>
-      <w:r>
-        <w:rPr>
-          <w:rFonts w:ascii="Consolas" w:hAnsi="Consolas"/>
-          <w:sz w:val="19"/>
-        </w:rPr>
-        <w:t>scripts/run_cpc_test_case.py</w:t>
-      </w:r>
-      <w:r>
-        <w:t xml:space="preserve"> runs that self-contained CPC verification case.</w:t>
+        <w:t xml:space="preserve"> The MIT-licensed reproducibility package, including the 675 per-realization inverse records and the 120-case timing benchmark, is at https://github.com/Javad-Alizargar/nanopore-pino-surrogate. The archived release is at Zenodo DOI: 10.5281/zenodo.23487404, and the interactive simulator is at https://pino.statwhy.com/.</w:t>
       </w:r>
     </w:p>
     <w:p/>

</xml_diff>

<commit_message>
Presentation fixes: 64-state Figure 6C caption, split S22B table, one-page letter
- Correct Figure 6C caption to the 64 states actually plotted
- Split S22 part B into B1 (errors) and B2 (coverage/convergence) so numbers
  no longer wrap in narrow columns
- Compress cover letters to one page, use first person throughout, and replace
  author approval wording with a single-author declaration
</commit_message>
<xml_diff>
--- a/manuscript/Cover_Letter_CPC.docx
+++ b/manuscript/Cover_Letter_CPC.docx
@@ -2,15 +2,6 @@
 <file path=word/document.xml><?xml version="1.0" encoding="utf-8"?>
 <w:document xmlns:wpc="http://schemas.microsoft.com/office/word/2010/wordprocessingCanvas" xmlns:mo="http://schemas.microsoft.com/office/mac/office/2008/main" xmlns:mc="http://schemas.openxmlformats.org/markup-compatibility/2006" xmlns:mv="urn:schemas-microsoft-com:mac:vml" xmlns:o="urn:schemas-microsoft-com:office:office" xmlns:r="http://schemas.openxmlformats.org/officeDocument/2006/relationships" xmlns:m="http://schemas.openxmlformats.org/officeDocument/2006/math" xmlns:v="urn:schemas-microsoft-com:vml" xmlns:wp14="http://schemas.microsoft.com/office/word/2010/wordprocessingDrawing" xmlns:wp="http://schemas.openxmlformats.org/drawingml/2006/wordprocessingDrawing" xmlns:w10="urn:schemas-microsoft-com:office:word" xmlns:w="http://schemas.openxmlformats.org/wordprocessingml/2006/main" xmlns:w14="http://schemas.microsoft.com/office/word/2010/wordml" xmlns:wpg="http://schemas.microsoft.com/office/word/2010/wordprocessingGroup" xmlns:wpi="http://schemas.microsoft.com/office/word/2010/wordprocessingInk" xmlns:wne="http://schemas.microsoft.com/office/word/2006/wordml" xmlns:wps="http://schemas.microsoft.com/office/word/2010/wordprocessingShape" mc:Ignorable="w14 wp14">
   <w:body>
-    <w:p>
-      <w:pPr>
-        <w:pStyle w:val="Heading1"/>
-      </w:pPr>
-      <w:r>
-        <w:t>Cover Letter</w:t>
-      </w:r>
-    </w:p>
-    <w:p/>
     <w:p>
       <w:r>
         <w:rPr>
@@ -22,16 +13,16 @@
         <w:t xml:space="preserve"> 23 October 2026</w:t>
       </w:r>
     </w:p>
-    <w:p/>
     <w:p>
       <w:r>
         <w:rPr>
           <w:b/>
         </w:rPr>
-        <w:t>To the Editors-in-Chief</w:t>
+        <w:t>To the Editors-in-Chief,</w:t>
       </w:r>
-    </w:p>
-    <w:p>
+      <w:r>
+        <w:t xml:space="preserve"> </w:t>
+      </w:r>
       <w:r>
         <w:rPr>
           <w:i/>
@@ -39,7 +30,6 @@
         <w:t>Computer Physics Communications</w:t>
       </w:r>
     </w:p>
-    <w:p/>
     <w:p>
       <w:r>
         <w:rPr>
@@ -51,31 +41,14 @@
         <w:t xml:space="preserve"> Submission of an original research article</w:t>
       </w:r>
     </w:p>
-    <w:p/>
     <w:p>
       <w:r>
         <w:t>Dear Editors,</w:t>
       </w:r>
     </w:p>
-    <w:p/>
     <w:p>
       <w:r>
-        <w:t xml:space="preserve">We submit this manuscript for consideration in </w:t>
-      </w:r>
-      <w:r>
-        <w:rPr>
-          <w:i/>
-        </w:rPr>
-        <w:t>Computer Physics Communications</w:t>
-      </w:r>
-      <w:r>
-        <w:t xml:space="preserve"> under the Computer Programs in Physics (CPiP) category. The software package PINO-Nanopore (archived permanently at Zenodo DOI: 10.5281/zenodo.23487404 and deployed interactively at https://pino.statwhy.com) provides a validated, exact-boundary solution operator for steady axisymmetric Poisson–Nernst–Planck transport, whose primary scientific application is high-throughput Fisher-information and conductance-identifiability mapping for nanopore experiments.</w:t>
-      </w:r>
-    </w:p>
-    <w:p/>
-    <w:p>
-      <w:r>
-        <w:t xml:space="preserve">I am pleased to submit the original research article entitled </w:t>
+        <w:t xml:space="preserve">I submit the original research article entitled </w:t>
       </w:r>
       <w:r>
         <w:rPr>
@@ -93,10 +66,9 @@
         <w:t>Computer Physics Communications</w:t>
       </w:r>
       <w:r>
-        <w:t>.</w:t>
+        <w:t>. The submission is under the Computer Programs in Physics (CPiP) category. The software package PINO-Nanopore (archived permanently at Zenodo DOI: 10.5281/zenodo.23487404 and deployed interactively at https://pino.statwhy.com) provides a validated, exact-boundary solution operator for steady axisymmetric Poisson–Nernst–Planck transport, whose primary scientific application is high-throughput Fisher-information and conductance-identifiability mapping for nanopore experiments.</w:t>
       </w:r>
     </w:p>
-    <w:p/>
     <w:p>
       <w:r>
         <w:rPr>
@@ -108,7 +80,6 @@
         <w:t xml:space="preserve"> Javad Alizargar, Department of Nursing, National Taipei University of Nursing and Health Sciences, No. 365, Mingde Rd, Beitou District, Taipei City 112, Taiwan (corresponding author: 8javad@ntunhs.edu.tw; ORCID: 0000-0003-2966-1315).</w:t>
       </w:r>
     </w:p>
-    <w:p/>
     <w:p>
       <w:r>
         <w:rPr>
@@ -126,10 +97,9 @@
         <w:t>"Exact-boundary data-assimilated physics-informed neural networks for coupled Poisson--Nernst--Planck transport at charged nanopore biointerfaces"</w:t>
       </w:r>
       <w:r>
-        <w:t>, was submitted to Computer Physics Communications as COMPHY-D-26-00857 (revision R1); it has not been published. That study is fixed-state: one network is trained for one operating point and needs about 500 s per new state. The present manuscript is a separate, related study. It reuses the verified SG/FV reference and the DA-PINN benchmark comparison, but its new contributions are the parameter-conditioned operator, the charge-balanced exact-boundary reparameterization with its controlled ablation, and the identifiability analysis with the blind inverse and warm-started solver benchmark. Shared methods and benchmark material are identified explicitly in the manuscript.</w:t>
+        <w:t>, was submitted to Computer Physics Communications as COMPHY-D-26-00857 (revision R1); it has not been published. That study is fixed-state and needs about 500 s per new state. The present manuscript is a separate, related study. It reuses the verified SG/FV reference and the DA-PINN benchmark comparison, but its new contributions are the parameter-conditioned operator, the charge-balanced exact-boundary reparameterization with its controlled ablation, and the identifiability analysis with the blind inverse and warm-started solver benchmark. Shared methods and benchmark material are identified explicitly in the manuscript.</w:t>
       </w:r>
     </w:p>
-    <w:p/>
     <w:p>
       <w:r>
         <w:rPr>
@@ -138,165 +108,14 @@
         <w:t>Contributions.</w:t>
       </w:r>
       <w:r>
-        <w:t xml:space="preserve"> (i) A single multi-scale radial physics-informed DeepONet maps the four parameters </w:t>
-      </w:r>
-      <m:oMath xmlns:a="http://schemas.openxmlformats.org/drawingml/2006/main" xmlns:pic="http://schemas.openxmlformats.org/drawingml/2006/picture">
-        <m:r>
-          <m:rPr>
-            <m:sty m:val="p"/>
-          </m:rPr>
-          <m:t>(</m:t>
-        </m:r>
-        <m:sSub>
-          <m:e>
-            <m:r>
-              <m:t>V</m:t>
-            </m:r>
-          </m:e>
-          <m:sub>
-            <m:r>
-              <m:rPr>
-                <m:nor/>
-                <m:sty m:val="p"/>
-              </m:rPr>
-              <m:t>app</m:t>
-            </m:r>
-          </m:sub>
-        </m:sSub>
-        <m:r>
-          <m:rPr>
-            <m:sty m:val="p"/>
-          </m:rPr>
-          <m:t>,</m:t>
-        </m:r>
-        <m:sSub>
-          <m:e>
-            <m:r>
-              <m:t>C</m:t>
-            </m:r>
-          </m:e>
-          <m:sub>
-            <m:r>
-              <m:t>0</m:t>
-            </m:r>
-          </m:sub>
-        </m:sSub>
-        <m:r>
-          <m:rPr>
-            <m:sty m:val="p"/>
-          </m:rPr>
-          <m:t>,</m:t>
-        </m:r>
-        <m:sSub>
-          <m:e>
-            <m:r>
-              <m:t>q</m:t>
-            </m:r>
-          </m:e>
-          <m:sub>
-            <m:r>
-              <m:t>w</m:t>
-            </m:r>
-          </m:sub>
-        </m:sSub>
-        <m:r>
-          <m:rPr>
-            <m:sty m:val="p"/>
-          </m:rPr>
-          <m:t>,</m:t>
-        </m:r>
-        <m:r>
-          <m:t>R</m:t>
-        </m:r>
-        <m:r>
-          <m:rPr>
-            <m:sty m:val="p"/>
-          </m:rPr>
-          <m:t>)</m:t>
-        </m:r>
-      </m:oMath>
-      <w:r>
-        <w:t xml:space="preserve"> to the coupled potential and ionic concentrations, with exact reservoir boundary conditions and a charge-balanced hyperbolic reconstruction that removes subtractive cancellation in net charge. On held-out states it reaches 0.00089 potential and 0.00109 current relative </w:t>
-      </w:r>
-      <m:oMath xmlns:a="http://schemas.openxmlformats.org/drawingml/2006/main" xmlns:pic="http://schemas.openxmlformats.org/drawingml/2006/picture">
-        <m:sSub>
-          <m:e>
-            <m:r>
-              <m:t>L</m:t>
-            </m:r>
-          </m:e>
-          <m:sub>
-            <m:r>
-              <m:t>2</m:t>
-            </m:r>
-          </m:sub>
-        </m:sSub>
-      </m:oMath>
-      <w:r>
-        <w:t xml:space="preserve"> error and runs in 0.072 ms per state after ONNX export. (ii) A Fisher-information analysis, validated against exact float64 SG/FV Jacobians, shows that a conductance-only measurement leaves wall charge practically unidentifiable for symmetric electrolytes with nearly equal diffusivities. A blind 675-realization study with exact SG/FV observations confirms the limit and shows that a dual current-plus-near-wall-selectivity protocol reaches 1.5% median charge error, but with 73% 95% coverage at 1% noise dominated by a 1.3% cross-grid discretization bias; single-salt fits do not converge, so their intervals are reported as provisional local intervals. (iii) A reference-free warm-started SG/FV solver reproduces the cold-solve current to </w:t>
-      </w:r>
-      <m:oMath xmlns:a="http://schemas.openxmlformats.org/drawingml/2006/main" xmlns:pic="http://schemas.openxmlformats.org/drawingml/2006/picture">
-        <m:r>
-          <m:t>5</m:t>
-        </m:r>
-        <m:r>
-          <m:rPr>
-            <m:sty m:val="p"/>
-          </m:rPr>
-          <m:t>×</m:t>
-        </m:r>
-        <m:sSup>
-          <m:e>
-            <m:r>
-              <m:t>10</m:t>
-            </m:r>
-          </m:e>
-          <m:sup>
-            <m:r>
-              <m:rPr>
-                <m:sty m:val="p"/>
-              </m:rPr>
-              <m:t>−</m:t>
-            </m:r>
-            <m:r>
-              <m:t>14</m:t>
-            </m:r>
-          </m:sup>
-        </m:sSup>
-      </m:oMath>
-      <w:r>
-        <w:t xml:space="preserve"> at 0.153 s (1.54</w:t>
-      </w:r>
-      <m:oMath xmlns:a="http://schemas.openxmlformats.org/drawingml/2006/main" xmlns:pic="http://schemas.openxmlformats.org/drawingml/2006/picture">
-        <m:r>
-          <m:rPr>
-            <m:sty m:val="p"/>
-          </m:rPr>
-          <m:t>×</m:t>
-        </m:r>
-      </m:oMath>
-      <w:r>
-        <w:t xml:space="preserve"> faster than a cold forward solve), and a warm-started reversal root is 1.19</w:t>
-      </w:r>
-      <m:oMath xmlns:a="http://schemas.openxmlformats.org/drawingml/2006/main" xmlns:pic="http://schemas.openxmlformats.org/drawingml/2006/picture">
-        <m:r>
-          <m:rPr>
-            <m:sty m:val="p"/>
-          </m:rPr>
-          <m:t>×</m:t>
-        </m:r>
-      </m:oMath>
-      <w:r>
-        <w:t xml:space="preserve"> faster than cold Brent. The 240-state benchmark, exact Jacobians, 120-case timing file, browser simulator, and MIT-licensed archive are included.</w:t>
+        <w:t xml:space="preserve"> (i) A single multi-scale radial physics-informed DeepONet maps the four parameters (applied voltage, salinity, wall charge, and radius) to the coupled potential and ionic concentrations, with exact reservoir boundary conditions and a charge-balanced hyperbolic reconstruction that removes subtractive cancellation in net charge. It reaches 0.00089/0.00109 relative L2 error for potential/current at 0.072 ms per state after ONNX export. (ii) A Fisher-information analysis, validated against exact float64 SG/FV Jacobians, shows that a conductance-only measurement leaves wall charge practically unidentifiable for symmetric electrolytes with nearly equal diffusivities. A blind 675-realization study with exact SG/FV observations confirms this limit: a dual current-plus-near-wall-selectivity protocol reaches 1.5% median charge error, but with 73% 95% coverage at 1% noise dominated by a 1.3% cross-grid discretization bias; single-salt fits do not converge, so their intervals are reported as provisional local intervals. (iii) A reference-free warm-started SG/FV solver reproduces the cold-solve current to 5 × 10⁻¹⁴ at 0.153 s (1.54× faster than a cold forward solve), and a warm-started reversal root is 1.19× faster than cold Brent. The benchmark, timing file, simulator, and MIT-licensed archive are included.</w:t>
       </w:r>
     </w:p>
-    <w:p/>
     <w:p>
       <w:r>
-        <w:t>The manuscript is original, has not been published previously, and is not under consideration elsewhere. All authors have approved the submission, and the author declares no competing interests.</w:t>
+        <w:t>The manuscript is original, has not been published previously, and is not under consideration elsewhere. I approve this submission and declare no competing interests.</w:t>
       </w:r>
     </w:p>
-    <w:p/>
     <w:p>
       <w:r>
         <w:rPr>
@@ -305,22 +124,19 @@
         <w:t>Data and code availability.</w:t>
       </w:r>
       <w:r>
-        <w:t xml:space="preserve"> The MIT-licensed reproducibility package, including the 675 per-realization inverse records and the 120-case timing benchmark, is at https://github.com/Javad-Alizargar/nanopore-pino-surrogate. The archived release is at Zenodo DOI: 10.5281/zenodo.23487404, and the interactive simulator is at https://pino.statwhy.com/.</w:t>
+        <w:t xml:space="preserve"> The MIT-licensed package, including the 675 inverse records and the 120-case timing benchmark, is at https://github.com/Javad-Alizargar/nanopore-pino-surrogate. The archived release is at Zenodo DOI: 10.5281/zenodo.23487404, and the simulator is at https://pino.statwhy.com/.</w:t>
       </w:r>
     </w:p>
-    <w:p/>
     <w:p>
       <w:r>
         <w:t>Thank you for considering this manuscript. I look forward to your response and would be glad to provide any additional information.</w:t>
       </w:r>
     </w:p>
-    <w:p/>
     <w:p>
       <w:r>
         <w:t>Sincerely,</w:t>
       </w:r>
     </w:p>
-    <w:p/>
     <w:p>
       <w:r>
         <w:rPr>
@@ -339,10 +155,9 @@
         <w:t>8javad@ntunhs.edu.tw | ORCID: 0000-0003-2966-1315</w:t>
       </w:r>
     </w:p>
-    <w:p/>
     <w:sectPr>
       <w:pgSz w:w="12240" w:h="15840"/>
-      <w:pgMar w:top="1440" w:right="1800" w:bottom="1440" w:left="1800" w:header="720" w:footer="720" w:gutter="0"/>
+      <w:pgMar w:top="1152" w:right="1224" w:bottom="1152" w:left="1224" w:header="720" w:footer="720" w:gutter="0"/>
       <w:cols w:space="720"/>
       <w:docGrid w:linePitch="360"/>
     </w:sectPr>
@@ -713,6 +528,9 @@
     <w:name w:val="Normal"/>
     <w:qFormat/>
     <w:rsid w:val="00FC693F"/>
+    <w:pPr>
+      <w:spacing w:before="0" w:after="60" w:line="240" w:lineRule="auto"/>
+    </w:pPr>
     <w:rPr>
       <w:rFonts w:ascii="Calibri" w:hAnsi="Calibri"/>
       <w:sz w:val="22"/>
@@ -773,7 +591,7 @@
     <w:pPr>
       <w:keepNext/>
       <w:keepLines/>
-      <w:spacing w:before="480" w:after="0"/>
+      <w:spacing w:before="0" w:after="120"/>
       <w:outlineLvl w:val="0"/>
     </w:pPr>
     <w:rPr>

</xml_diff>